<commit_message>
Build reproducible sentiment robustness checks (predictive power, placebo test)
Adds src/robustness.py: pooled lagged-sentiment-vs-return correlations at
1/5/21-day horizons, a 300-shuffle cross-sectional placebo test per equity
fund, and a weight-vs-sentiment-tilt correlation check - wired into
scripts/run_part_b.py and saved to results/tables/. These numbers were
previously stated in the report with no corresponding code anywhere in the
repo; report/report.docx Section 4 and the Conclusion are updated to the
real, reproducible values (the placebo/weight-tilt numbers came back close
to what was already written; the predictive-power correlations changed
more, including a sign flip at the 1-day horizon).

Also fixes a mismatched Figure 7: it was showing the base/vanilla/extended
fusion bar chart instead of the sensitivity-to-tilt-strength chart its
caption promises. Added plot_sharpe_sensitivity() and swapped it in.
</commit_message>
<xml_diff>
--- a/report/report.docx
+++ b/report/report.docx
@@ -6493,11 +6493,12 @@
       <w:r>
         <w:rPr>
           <w:rFonts w:ascii="Times New Roman" w:hAnsi="Times New Roman" w:eastAsia="Times New Roman" w:cs="Times New Roman"/>
+          <w:i w:val="0"/>
           <w:color w:val="000000"/>
           <w:sz w:val="22"/>
           <w:szCs w:val="22"/>
         </w:rPr>
-        <w:t>The correlations were approximately -0.0008 at the one-day horizon, -0.0106 at five days, and -0.0166 at 21 days. The one-day relationship was statistically insignificant, with a p-value of approximately 0.87. The five-day and 21-day relationships were statistically significant because of the large number of observations, but the correlation magnitudes remained extremely small.</w:t>
+        <w:t>The pooled correlations across all ticker-days were approximately 0.0056 at the one-day horizon, -0.0078 at five days, and -0.0138 at 21 days. The one-day relationship was statistically insignificant, with a p-value of approximately 0.21. The five-day relationship was also not significant at conventional levels (p approximately 0.08), and only the 21-day relationship was statistically significant (p approximately 0.002) because of the large number of observations; in every case the correlation magnitude remained extremely small.</w:t>
       </w:r>
     </w:p>
     <w:p>
@@ -6635,11 +6636,12 @@
       <w:r>
         <w:rPr>
           <w:rFonts w:ascii="Times New Roman" w:hAnsi="Times New Roman" w:eastAsia="Times New Roman" w:cs="Times New Roman"/>
+          <w:i w:val="0"/>
           <w:color w:val="000000"/>
           <w:sz w:val="22"/>
           <w:szCs w:val="22"/>
         </w:rPr>
-        <w:t>For equal-weight, the real sentiment result was approximately 0.793, compared with a random-shuffle mean of approximately 0.770 and standard deviation of 0.076. The real result was around the 64th percentile.</w:t>
+        <w:t>For equal-weight, the real sentiment result was approximately 0.793, compared with a random-shuffle mean of approximately 0.779 and standard deviation of 0.063. The real result was around the 60th percentile.</w:t>
       </w:r>
     </w:p>
     <w:p>
@@ -6663,11 +6665,12 @@
       <w:r>
         <w:rPr>
           <w:rFonts w:ascii="Times New Roman" w:hAnsi="Times New Roman" w:eastAsia="Times New Roman" w:cs="Times New Roman"/>
+          <w:i w:val="0"/>
           <w:color w:val="000000"/>
           <w:sz w:val="22"/>
           <w:szCs w:val="22"/>
         </w:rPr>
-        <w:t>The maximum-Sharpe result is more unusual. The real sentiment strategy produced a Sharpe ratio of approximately 0.235, compared with a random-shuffle mean of approximately 0.372 and standard deviation of 0.117. The real result was around the 14th percentile, meaning that approximately 86% of the randomised sentiment allocations produced a higher Sharpe ratio.</w:t>
+        <w:t>The maximum-Sharpe result is more unusual. The real sentiment strategy produced a Sharpe ratio of approximately 0.235, compared with a random-shuffle mean of approximately 0.376 and standard deviation of 0.113. The real result was around the 10th percentile, meaning that approximately 90% of the randomised sentiment allocations produced a higher Sharpe ratio.</w:t>
       </w:r>
     </w:p>
     <w:p>
@@ -6741,27 +6744,24 @@
       </w:r>
     </w:p>
     <w:p>
-      <w:pPr>
-        <w:spacing w:after="200" w:line="276" w:lineRule="auto"/>
-      </w:pPr>
+      <w:pPr/>
       <w:r>
         <w:drawing>
-          <wp:inline distT="0" distB="0" distL="0" distR="0">
+          <wp:inline xmlns:a="http://schemas.openxmlformats.org/drawingml/2006/main" xmlns:pic="http://schemas.openxmlformats.org/drawingml/2006/picture">
             <wp:extent cx="5486400" cy="3048000"/>
-            <wp:effectExtent l="0" t="0" r="0" b="0"/>
-            <wp:docPr id="100006" name="Picture 100006"/>
+            <wp:docPr id="100007" name="Picture 100007"/>
             <wp:cNvGraphicFramePr>
-              <a:graphicFrameLocks xmlns:a="http://schemas.openxmlformats.org/drawingml/2006/main" noChangeAspect="1"/>
+              <a:graphicFrameLocks noChangeAspect="1"/>
             </wp:cNvGraphicFramePr>
-            <a:graphic xmlns:a="http://schemas.openxmlformats.org/drawingml/2006/main">
+            <a:graphic>
               <a:graphicData uri="http://schemas.openxmlformats.org/drawingml/2006/picture">
-                <pic:pic xmlns:pic="http://schemas.openxmlformats.org/drawingml/2006/picture">
+                <pic:pic>
                   <pic:nvPicPr>
-                    <pic:cNvPr id="100006" name="image100006"/>
+                    <pic:cNvPr id="0" name="sharpe_sensitivity.png"/>
                     <pic:cNvPicPr/>
                   </pic:nvPicPr>
                   <pic:blipFill>
-                    <a:blip r:embed="rId22"/>
+                    <a:blip r:embed="rId23"/>
                     <a:stretch>
                       <a:fillRect/>
                     </a:stretch>
@@ -6771,9 +6771,7 @@
                       <a:off x="0" y="0"/>
                       <a:ext cx="5486400" cy="3048000"/>
                     </a:xfrm>
-                    <a:prstGeom prst="rect">
-                      <a:avLst/>
-                    </a:prstGeom>
+                    <a:prstGeom prst="rect"/>
                   </pic:spPr>
                 </pic:pic>
               </a:graphicData>
@@ -7829,7 +7827,7 @@
           <w:sz w:val="22"/>
           <w:szCs w:val="22"/>
         </w:rPr>
-        <w:t>The placebo experiment strengthens this conclusion. Real sentiment performs similarly to randomised sentiment for minimum-variance and equal-weight portfolios, while the maximum-Sharpe sentiment strategy performs worse than approximately 86% of randomised alternatives. A subsequent test found no meaningful relationship between maximum-Sharpe baseline weights and sentiment tilt scores, so the precise reason for this unusually poor result remains unresolved.</w:t>
+        <w:t>The placebo experiment strengthens this conclusion. Real sentiment performs similarly to randomised sentiment for minimum-variance and equal-weight portfolios, while the maximum-Sharpe sentiment strategy performs worse than approximately 90% of randomised alternatives. A subsequent test found no meaningful relationship between maximum-Sharpe baseline weights and sentiment tilt scores, so the precise reason for this unusually poor result remains unresolved.</w:t>
       </w:r>
     </w:p>
     <w:p>

</xml_diff>